<commit_message>
Màj test cases docx
</commit_message>
<xml_diff>
--- a/Purple_Team_Test_case_documentation.docx
+++ b/Purple_Team_Test_case_documentation.docx
@@ -97,20 +97,8 @@
           <w:u w:val="single"/>
           <w:lang w:val="en-US"/>
         </w:rPr>
-        <w:t xml:space="preserve">1. UI automation </w:t>
+        <w:t>1. UI automation tests :</w:t>
       </w:r>
-      <w:proofErr w:type="gramStart"/>
-      <w:r>
-        <w:rPr>
-          <w:rFonts w:ascii="Aptos" w:hAnsi="Aptos"/>
-          <w:sz w:val="16"/>
-          <w:szCs w:val="16"/>
-          <w:u w:val="single"/>
-          <w:lang w:val="en-US"/>
-        </w:rPr>
-        <w:t>tests :</w:t>
-      </w:r>
-      <w:proofErr w:type="gramEnd"/>
     </w:p>
     <w:tbl>
       <w:tblPr>
@@ -647,7 +635,7 @@
                 <w:szCs w:val="16"/>
                 <w:lang w:val="en-US"/>
               </w:rPr>
-              <w:t xml:space="preserve"> and dashboard title is visible.</w:t>
+              <w:t xml:space="preserve"> and dashboard title is visible</w:t>
             </w:r>
           </w:p>
         </w:tc>
@@ -904,7 +892,6 @@
                 <w:lang w:val="en-US"/>
               </w:rPr>
             </w:pPr>
-            <w:proofErr w:type="gramStart"/>
             <w:r>
               <w:rPr>
                 <w:rFonts w:ascii="Aptos" w:hAnsi="Aptos"/>
@@ -936,7 +923,6 @@
               <w:t>oxd</w:t>
             </w:r>
             <w:proofErr w:type="spellEnd"/>
-            <w:proofErr w:type="gramEnd"/>
             <w:r>
               <w:rPr>
                 <w:rFonts w:ascii="Aptos" w:eastAsia="Roboto Mono" w:hAnsi="Aptos" w:cs="Roboto Mono"/>
@@ -954,7 +940,7 @@
                 <w:szCs w:val="16"/>
                 <w:lang w:val="en-US"/>
               </w:rPr>
-              <w:t xml:space="preserve"> visible with text "Invalid credentials".</w:t>
+              <w:t xml:space="preserve"> visible with text "Invalid credentials"</w:t>
             </w:r>
           </w:p>
         </w:tc>
@@ -1301,7 +1287,7 @@
                 <w:szCs w:val="16"/>
                 <w:lang w:val="en-US"/>
               </w:rPr>
-              <w:t>"Successfully Saved" toast displayed and redirected to the created profile.</w:t>
+              <w:t>"Successfully Saved" toast displayed and redirected to the created profile</w:t>
             </w:r>
           </w:p>
         </w:tc>
@@ -1585,7 +1571,7 @@
                 <w:szCs w:val="16"/>
                 <w:lang w:val="en-US"/>
               </w:rPr>
-              <w:t>Attachments table displays new row containing "contract.pdf".</w:t>
+              <w:t>Attachments table displays new row containing "contract.pdf"</w:t>
             </w:r>
           </w:p>
         </w:tc>
@@ -1830,17 +1816,7 @@
                 <w:szCs w:val="16"/>
                 <w:lang w:val="en-US"/>
               </w:rPr>
-              <w:t xml:space="preserve">Error message </w:t>
-            </w:r>
-            <w:proofErr w:type="gramStart"/>
-            <w:r>
-              <w:rPr>
-                <w:rFonts w:ascii="Aptos" w:hAnsi="Aptos"/>
-                <w:sz w:val="16"/>
-                <w:szCs w:val="16"/>
-                <w:lang w:val="en-US"/>
-              </w:rPr>
-              <w:t xml:space="preserve">visible </w:t>
+              <w:t xml:space="preserve">Error message visible </w:t>
             </w:r>
             <w:r>
               <w:rPr>
@@ -1864,7 +1840,6 @@
               <w:t>oxd</w:t>
             </w:r>
             <w:proofErr w:type="spellEnd"/>
-            <w:proofErr w:type="gramEnd"/>
             <w:r>
               <w:rPr>
                 <w:rFonts w:ascii="Aptos" w:eastAsia="Roboto Mono" w:hAnsi="Aptos" w:cs="Roboto Mono"/>
@@ -1882,7 +1857,7 @@
                 <w:szCs w:val="16"/>
                 <w:lang w:val="en-US"/>
               </w:rPr>
-              <w:t xml:space="preserve"> and file not saved.</w:t>
+              <w:t xml:space="preserve"> and file not saved</w:t>
             </w:r>
           </w:p>
         </w:tc>
@@ -2237,7 +2212,7 @@
                 <w:szCs w:val="16"/>
                 <w:lang w:val="en-US"/>
               </w:rPr>
-              <w:t>"Successfully Updated" toast displayed and selectors retain chosen values.</w:t>
+              <w:t>"Successfully Updated" toast displayed and selectors retain chosen values</w:t>
             </w:r>
           </w:p>
         </w:tc>
@@ -2564,7 +2539,7 @@
                 <w:szCs w:val="16"/>
                 <w:lang w:val="en-US"/>
               </w:rPr>
-              <w:t>Inline error message "Should be higher than Minimum Salary" visible.</w:t>
+              <w:t>Inline error message "Should be higher than Minimum Salary" visible</w:t>
             </w:r>
           </w:p>
         </w:tc>
@@ -2844,7 +2819,7 @@
                 <w:szCs w:val="16"/>
                 <w:lang w:val="en-US"/>
               </w:rPr>
-              <w:t>Confirmation modal intercepted and deleted item disappears from table.</w:t>
+              <w:t>Confirmation modal intercepted and deleted item disappears from table</w:t>
             </w:r>
           </w:p>
         </w:tc>
@@ -3223,7 +3198,7 @@
                 <w:szCs w:val="16"/>
                 <w:lang w:val="en-US"/>
               </w:rPr>
-              <w:t>Success message displayed and request listed in Leave &gt; My Leave as "Pending Approval".</w:t>
+              <w:t>Success message displayed and request listed in Leave &gt; My Leave as "Pending Approval"</w:t>
             </w:r>
           </w:p>
         </w:tc>
@@ -3507,7 +3482,7 @@
                 <w:szCs w:val="16"/>
                 <w:lang w:val="en-US"/>
               </w:rPr>
-              <w:t>Success on each iteration and presence of all 3 accounts in Admin list.</w:t>
+              <w:t>Success on each iteration and presence of all 3 accounts in Admin list</w:t>
             </w:r>
           </w:p>
         </w:tc>
@@ -3672,20 +3647,8 @@
           <w:lang w:val="en-US"/>
         </w:rPr>
         <w:lastRenderedPageBreak/>
-        <w:t xml:space="preserve">2. API automation </w:t>
+        <w:t>2. API automation tests :</w:t>
       </w:r>
-      <w:proofErr w:type="gramStart"/>
-      <w:r>
-        <w:rPr>
-          <w:rFonts w:ascii="Aptos" w:hAnsi="Aptos"/>
-          <w:sz w:val="16"/>
-          <w:szCs w:val="16"/>
-          <w:u w:val="single"/>
-          <w:lang w:val="en-US"/>
-        </w:rPr>
-        <w:t>tests :</w:t>
-      </w:r>
-      <w:proofErr w:type="gramEnd"/>
     </w:p>
     <w:tbl>
       <w:tblPr>
@@ -4309,7 +4272,7 @@
                 <w:szCs w:val="16"/>
                 <w:lang w:val="en-US"/>
               </w:rPr>
-              <w:t xml:space="preserve"> array.</w:t>
+              <w:t xml:space="preserve"> array</w:t>
             </w:r>
           </w:p>
         </w:tc>
@@ -4721,7 +4684,6 @@
               <w:t xml:space="preserve">Field </w:t>
             </w:r>
             <w:proofErr w:type="spellStart"/>
-            <w:proofErr w:type="gramStart"/>
             <w:r>
               <w:rPr>
                 <w:rFonts w:ascii="Aptos" w:eastAsia="Roboto Mono" w:hAnsi="Aptos" w:cs="Roboto Mono"/>
@@ -4733,7 +4695,6 @@
               <w:t>data.empNumber</w:t>
             </w:r>
             <w:proofErr w:type="spellEnd"/>
-            <w:proofErr w:type="gramEnd"/>
             <w:r>
               <w:rPr>
                 <w:rFonts w:ascii="Aptos" w:hAnsi="Aptos"/>
@@ -4744,7 +4705,6 @@
               <w:t xml:space="preserve"> is returned and </w:t>
             </w:r>
             <w:proofErr w:type="spellStart"/>
-            <w:proofErr w:type="gramStart"/>
             <w:r>
               <w:rPr>
                 <w:rFonts w:ascii="Aptos" w:eastAsia="Roboto Mono" w:hAnsi="Aptos" w:cs="Roboto Mono"/>
@@ -4756,15 +4716,14 @@
               <w:t>data.firstName</w:t>
             </w:r>
             <w:proofErr w:type="spellEnd"/>
-            <w:proofErr w:type="gramEnd"/>
-            <w:r>
-              <w:rPr>
-                <w:rFonts w:ascii="Aptos" w:hAnsi="Aptos"/>
-                <w:sz w:val="16"/>
-                <w:szCs w:val="16"/>
-                <w:lang w:val="en-US"/>
-              </w:rPr>
-              <w:t xml:space="preserve"> equals "QA". ID is stored.</w:t>
+            <w:r>
+              <w:rPr>
+                <w:rFonts w:ascii="Aptos" w:hAnsi="Aptos"/>
+                <w:sz w:val="16"/>
+                <w:szCs w:val="16"/>
+                <w:lang w:val="en-US"/>
+              </w:rPr>
+              <w:t xml:space="preserve"> equals "QA". ID is stored</w:t>
             </w:r>
           </w:p>
         </w:tc>
@@ -5141,7 +5100,7 @@
                 <w:szCs w:val="16"/>
                 <w:lang w:val="en-US"/>
               </w:rPr>
-              <w:t xml:space="preserve"> in response match injected values.</w:t>
+              <w:t xml:space="preserve"> in response match injected values</w:t>
             </w:r>
           </w:p>
         </w:tc>
@@ -5465,7 +5424,7 @@
                 <w:szCs w:val="16"/>
                 <w:lang w:val="en-US"/>
               </w:rPr>
-              <w:t xml:space="preserve">Deletion confirmation in response body, and subsequent GET returns </w:t>
+              <w:t xml:space="preserve">Deletion confirmation in response body, and GET returns </w:t>
             </w:r>
             <w:r>
               <w:rPr>
@@ -5476,15 +5435,6 @@
                 <w:lang w:val="en-US"/>
               </w:rPr>
               <w:t>404 Not Found</w:t>
-            </w:r>
-            <w:r>
-              <w:rPr>
-                <w:rFonts w:ascii="Aptos" w:hAnsi="Aptos"/>
-                <w:sz w:val="16"/>
-                <w:szCs w:val="16"/>
-                <w:lang w:val="en-US"/>
-              </w:rPr>
-              <w:t>.</w:t>
             </w:r>
           </w:p>
         </w:tc>
@@ -5814,7 +5764,7 @@
                 <w:szCs w:val="16"/>
                 <w:lang w:val="en-US"/>
               </w:rPr>
-              <w:t>HTTP status code indicates client error and JSON details missing fields.</w:t>
+              <w:t>HTTP status code indicates client error and JSON details missing fields</w:t>
             </w:r>
           </w:p>
         </w:tc>

</xml_diff>